<commit_message>
Completar migración a solo pygame y consolidar dominio en Comun.
Elimina el modo consola y centraliza servicios en Juego/Comun. Actualiza tests, CI, documentación y memoria TFG. Endurece la limpieza externa de Juego/Data y las rutas de escritura del .exe.

Co-authored-by: Cursor <cursoragent@cursor.com>
</commit_message>
<xml_diff>
--- a/Docs/Entrega/Memoria_TFG_markdown.docx
+++ b/Docs/Entrega/Memoria_TFG_markdown.docx
@@ -2,7 +2,7 @@
 <file path=word/document.xml><?xml version="1.0" encoding="utf-8"?>
 <w:document xmlns:w="http://schemas.openxmlformats.org/wordprocessingml/2006/main" xmlns:m="http://schemas.openxmlformats.org/officeDocument/2006/math" xmlns:r="http://schemas.openxmlformats.org/officeDocument/2006/relationships" xmlns:o="urn:schemas-microsoft-com:office:office" xmlns:v="urn:schemas-microsoft-com:vml" xmlns:w10="urn:schemas-microsoft-com:office:word" xmlns:a="http://schemas.openxmlformats.org/drawingml/2006/main" xmlns:pic="http://schemas.openxmlformats.org/drawingml/2006/picture" xmlns:wp="http://schemas.openxmlformats.org/drawingml/2006/wordprocessingDrawing">
   <w:body>
-    <w:bookmarkStart w:id="74" w:name="X5d45246c0fca93b92ee2b2186a7233016177a7d"/>
+    <w:bookmarkStart w:id="75" w:name="X5d45246c0fca93b92ee2b2186a7233016177a7d"/>
     <w:p>
       <w:pPr>
         <w:pStyle w:val="Heading1"/>
@@ -92,7 +92,23 @@
         <w:t xml:space="preserve"> </w:t>
       </w:r>
       <w:r>
-        <w:t xml:space="preserve">es el cuestionario (banco + modos de juego en consola y gráfico pygame) descrito en esta memoria; la capa narrativa escape room completa queda como evolución futura del mismo proyecto.</w:t>
+        <w:t xml:space="preserve">es el cuestionario (banco + juego en</w:t>
+      </w:r>
+      <w:r>
+        <w:t xml:space="preserve"> </w:t>
+      </w:r>
+      <w:r>
+        <w:rPr>
+          <w:b/>
+          <w:bCs/>
+        </w:rPr>
+        <w:t xml:space="preserve">pygame</w:t>
+      </w:r>
+      <w:r>
+        <w:t xml:space="preserve"> </w:t>
+      </w:r>
+      <w:r>
+        <w:t xml:space="preserve">con cuatro modos) descrito en esta memoria; la capa narrativa escape room completa queda como evolución futura del mismo proyecto.</w:t>
       </w:r>
     </w:p>
     <w:p>
@@ -227,7 +243,23 @@
         <w:t xml:space="preserve"> </w:t>
       </w:r>
       <w:r>
-        <w:t xml:space="preserve">con metadatos curriculares, un juego en consola con cuatro modos (libre, historia, resistencia y feedback), una versión gráfica en pygame (libre, historia y resistencia) y herramientas de validación del dataset. El documento de proyecto inicial planteaba un escape room con interfaz gráfica; se adoptó un enfoque incremental que prioriza el contenido evaluable y el motor de juego antes de la capa narrativa visual. Los resultados muestran un sistema funcional, documentado y extensible; la validación con usuarios y la narrativa gráfica quedan como trabajo futuro.</w:t>
+        <w:t xml:space="preserve">con metadatos curriculares, un juego en</w:t>
+      </w:r>
+      <w:r>
+        <w:t xml:space="preserve"> </w:t>
+      </w:r>
+      <w:r>
+        <w:rPr>
+          <w:b/>
+          <w:bCs/>
+        </w:rPr>
+        <w:t xml:space="preserve">pygame</w:t>
+      </w:r>
+      <w:r>
+        <w:t xml:space="preserve"> </w:t>
+      </w:r>
+      <w:r>
+        <w:t xml:space="preserve">con cuatro modos (libre, historia, resistencia y feedback), y herramientas de validación del dataset. El desarrollo siguió un enfoque incremental: primero un prototipo en terminal para validar el motor de evaluación y, después, una interfaz gráfica que concentra toda la experiencia de juego. Los resultados muestran un sistema funcional, documentado y extensible; la validación con usuarios y la narrativa gráfica quedan como trabajo futuro.</w:t>
       </w:r>
     </w:p>
     <w:p>
@@ -402,7 +434,7 @@
         <w:t xml:space="preserve"> </w:t>
       </w:r>
       <w:r>
-        <w:t xml:space="preserve">designa el uso de elementos de diseño de juego (puntos, vidas, retos, progresión) en un contexto formativo no recreativo (Deterding et al., 2011); en este TFG se aplica al cuestionario en consola sin interfaz gráfica. Un</w:t>
+        <w:t xml:space="preserve">designa el uso de elementos de diseño de juego (puntos, vidas, retos, progresión) en un contexto formativo no recreativo (Deterding et al., 2011); en este TFG se aplica al cuestionario interactivo con retroalimentación inmediata en pantalla. Un</w:t>
       </w:r>
       <w:r>
         <w:t xml:space="preserve"> </w:t>
@@ -546,10 +578,38 @@
           <w:b/>
           <w:bCs/>
         </w:rPr>
-        <w:t xml:space="preserve">prototipo jugable en consola</w:t>
-      </w:r>
-      <w:r>
-        <w:t xml:space="preserve">, decisión metodológica coherente con un enfoque incremental: primero validar el contenido y la lógica de evaluación; después añadir la capa narrativa y gráfica.</w:t>
+        <w:t xml:space="preserve">prototipo jugable</w:t>
+      </w:r>
+      <w:r>
+        <w:t xml:space="preserve"> </w:t>
+      </w:r>
+      <w:r>
+        <w:t xml:space="preserve">(primero en terminal, después en pygame), decisión metodológica coherente con un enfoque incremental: validar el contenido y la lógica de evaluación antes de la capa narrativa visual. En junio de 2026 el código se unificó en una</w:t>
+      </w:r>
+      <w:r>
+        <w:t xml:space="preserve"> </w:t>
+      </w:r>
+      <w:r>
+        <w:rPr>
+          <w:b/>
+          <w:bCs/>
+        </w:rPr>
+        <w:t xml:space="preserve">única interfaz gráfica</w:t>
+      </w:r>
+      <w:r>
+        <w:t xml:space="preserve"> </w:t>
+      </w:r>
+      <w:r>
+        <w:t xml:space="preserve">(</w:t>
+      </w:r>
+      <w:r>
+        <w:rPr>
+          <w:rStyle w:val="VerbatimChar"/>
+        </w:rPr>
+        <w:t xml:space="preserve">juego_grafico.py</w:t>
+      </w:r>
+      <w:r>
+        <w:t xml:space="preserve">).</w:t>
       </w:r>
     </w:p>
     <w:bookmarkEnd w:id="14"/>
@@ -1505,7 +1565,7 @@
         <w:t xml:space="preserve"> </w:t>
       </w:r>
       <w:r>
-        <w:t xml:space="preserve">dataset, scripts de mantenimiento, motor de partida en consola.</w:t>
+        <w:t xml:space="preserve">dataset, scripts de mantenimiento, motor de partida y juego en pygame.</w:t>
       </w:r>
     </w:p>
     <w:p>
@@ -2042,7 +2102,32 @@
         </w:numPr>
       </w:pPr>
       <w:r>
-        <w:t xml:space="preserve">Lenguaje: Python 3.10+ (biblioteca estándar en el juego; sin dependencias externas obligatorias).</w:t>
+        <w:t xml:space="preserve">Lenguaje: Python 3.10+;</w:t>
+      </w:r>
+      <w:r>
+        <w:t xml:space="preserve"> </w:t>
+      </w:r>
+      <w:r>
+        <w:rPr>
+          <w:b/>
+          <w:bCs/>
+        </w:rPr>
+        <w:t xml:space="preserve">pygame-ce</w:t>
+      </w:r>
+      <w:r>
+        <w:t xml:space="preserve"> </w:t>
+      </w:r>
+      <w:r>
+        <w:t xml:space="preserve">para la interfaz gráfica (</w:t>
+      </w:r>
+      <w:r>
+        <w:rPr>
+          <w:rStyle w:val="VerbatimChar"/>
+        </w:rPr>
+        <w:t xml:space="preserve">requirements.txt</w:t>
+      </w:r>
+      <w:r>
+        <w:t xml:space="preserve">).</w:t>
       </w:r>
     </w:p>
     <w:p>
@@ -2069,7 +2154,19 @@
         <w:t xml:space="preserve"> </w:t>
       </w:r>
       <w:r>
-        <w:t xml:space="preserve">locales.</w:t>
+        <w:t xml:space="preserve">locales bajo</w:t>
+      </w:r>
+      <w:r>
+        <w:t xml:space="preserve"> </w:t>
+      </w:r>
+      <w:r>
+        <w:rPr>
+          <w:rStyle w:val="VerbatimChar"/>
+        </w:rPr>
+        <w:t xml:space="preserve">Data/Juego/</w:t>
+      </w:r>
+      <w:r>
+        <w:t xml:space="preserve">.</w:t>
       </w:r>
     </w:p>
     <w:p>
@@ -2081,19 +2178,31 @@
         </w:numPr>
       </w:pPr>
       <w:r>
-        <w:t xml:space="preserve">Empaquetado opcional: PyInstaller (Windows), script</w:t>
-      </w:r>
-      <w:r>
-        <w:t xml:space="preserve"> </w:t>
+        <w:t xml:space="preserve">Empaquetado opcional: PyInstaller (</w:t>
       </w:r>
       <w:r>
         <w:rPr>
           <w:rStyle w:val="VerbatimChar"/>
         </w:rPr>
-        <w:t xml:space="preserve">build_exe_onefile.ps1</w:t>
-      </w:r>
-      <w:r>
-        <w:t xml:space="preserve">.</w:t>
+        <w:t xml:space="preserve">Juego/build_exe_onefile.ps1</w:t>
+      </w:r>
+      <w:r>
+        <w:t xml:space="preserve"> </w:t>
+      </w:r>
+      <w:r>
+        <w:t xml:space="preserve">→</w:t>
+      </w:r>
+      <w:r>
+        <w:t xml:space="preserve"> </w:t>
+      </w:r>
+      <w:r>
+        <w:rPr>
+          <w:rStyle w:val="VerbatimChar"/>
+        </w:rPr>
+        <w:t xml:space="preserve">juego_grafico.exe</w:t>
+      </w:r>
+      <w:r>
+        <w:t xml:space="preserve">).</w:t>
       </w:r>
     </w:p>
     <w:p>
@@ -2229,22 +2338,16 @@
               <w:pStyle w:val="Compact"/>
             </w:pPr>
             <w:r>
-              <w:t xml:space="preserve">Lanzadores</w:t>
-            </w:r>
-          </w:p>
-        </w:tc>
-        <w:tc>
-          <w:tcPr/>
-          <w:p>
-            <w:pPr>
-              <w:pStyle w:val="Compact"/>
-            </w:pPr>
-            <w:r>
-              <w:rPr>
-                <w:rStyle w:val="VerbatimChar"/>
-              </w:rPr>
-              <w:t xml:space="preserve">juego_consola.py</w:t>
-            </w:r>
+              <w:t xml:space="preserve">Lanzador</w:t>
+            </w:r>
+          </w:p>
+        </w:tc>
+        <w:tc>
+          <w:tcPr/>
+          <w:p>
+            <w:pPr>
+              <w:pStyle w:val="Compact"/>
+            </w:pPr>
             <w:r>
               <w:rPr>
                 <w:rStyle w:val="VerbatimChar"/>
@@ -2260,7 +2363,7 @@
               <w:pStyle w:val="Compact"/>
             </w:pPr>
             <w:r>
-              <w:t xml:space="preserve">Terminal y pygame (libre, historia, resistencia)</w:t>
+              <w:t xml:space="preserve">Arranque pygame (libre, historia, resistencia, feedback)</w:t>
             </w:r>
           </w:p>
         </w:tc>
@@ -2326,74 +2429,42 @@
               <w:t xml:space="preserve">datos.py</w:t>
             </w:r>
             <w:r>
-              <w:t xml:space="preserve">, resistencia, …)</w:t>
-            </w:r>
-          </w:p>
-        </w:tc>
-        <w:tc>
-          <w:tcPr/>
-          <w:p>
-            <w:pPr>
-              <w:pStyle w:val="Compact"/>
-            </w:pPr>
-            <w:r>
-              <w:t xml:space="preserve">Reglas, puntuación, pool, rutas — compartido</w:t>
-            </w:r>
-          </w:p>
-        </w:tc>
-      </w:tr>
-      <w:tr>
-        <w:tc>
-          <w:tcPr/>
-          <w:p>
-            <w:pPr>
-              <w:pStyle w:val="Compact"/>
-            </w:pPr>
-            <w:r>
-              <w:t xml:space="preserve">Modos (consola)</w:t>
-            </w:r>
-          </w:p>
-        </w:tc>
-        <w:tc>
-          <w:tcPr/>
-          <w:p>
-            <w:pPr>
-              <w:pStyle w:val="Compact"/>
-            </w:pPr>
+              <w:t xml:space="preserve">,</w:t>
+            </w:r>
+            <w:r>
+              <w:t xml:space="preserve"> </w:t>
+            </w:r>
             <w:r>
               <w:rPr>
                 <w:rStyle w:val="VerbatimChar"/>
               </w:rPr>
-              <w:t xml:space="preserve">modo_libre.py</w:t>
+              <w:t xml:space="preserve">informe_examen.py</w:t>
+            </w:r>
+            <w:r>
+              <w:t xml:space="preserve">,</w:t>
+            </w:r>
+            <w:r>
+              <w:t xml:space="preserve"> </w:t>
             </w:r>
             <w:r>
               <w:rPr>
                 <w:rStyle w:val="VerbatimChar"/>
               </w:rPr>
-              <w:t xml:space="preserve">modo_historia.py</w:t>
-            </w:r>
-            <w:r>
-              <w:rPr>
-                <w:rStyle w:val="VerbatimChar"/>
-              </w:rPr>
-              <w:t xml:space="preserve">motor_resistencia.py</w:t>
-            </w:r>
-            <w:r>
-              <w:rPr>
-                <w:rStyle w:val="VerbatimChar"/>
-              </w:rPr>
-              <w:t xml:space="preserve">modo_feedback.py</w:t>
-            </w:r>
-          </w:p>
-        </w:tc>
-        <w:tc>
-          <w:tcPr/>
-          <w:p>
-            <w:pPr>
-              <w:pStyle w:val="Compact"/>
-            </w:pPr>
-            <w:r>
-              <w:t xml:space="preserve">Flujos pedagógicos en terminal</w:t>
+              <w:t xml:space="preserve">envio_feedback.py</w:t>
+            </w:r>
+            <w:r>
+              <w:t xml:space="preserve">, resistencia, …)</w:t>
+            </w:r>
+          </w:p>
+        </w:tc>
+        <w:tc>
+          <w:tcPr/>
+          <w:p>
+            <w:pPr>
+              <w:pStyle w:val="Compact"/>
+            </w:pPr>
+            <w:r>
+              <w:t xml:space="preserve">Reglas, puntuación, pool, informes, rutas</w:t>
             </w:r>
           </w:p>
         </w:tc>
@@ -2483,7 +2554,7 @@
               <w:pStyle w:val="Compact"/>
             </w:pPr>
             <w:r>
-              <w:t xml:space="preserve">Interacción (consola)</w:t>
+              <w:t xml:space="preserve">Historia</w:t>
             </w:r>
           </w:p>
         </w:tc>
@@ -2497,75 +2568,7 @@
               <w:rPr>
                 <w:rStyle w:val="VerbatimChar"/>
               </w:rPr>
-              <w:t xml:space="preserve">consola.py</w:t>
-            </w:r>
-            <w:r>
-              <w:rPr>
-                <w:rStyle w:val="VerbatimChar"/>
-              </w:rPr>
-              <w:t xml:space="preserve">entrada_teclas.py</w:t>
-            </w:r>
-            <w:r>
-              <w:rPr>
-                <w:rStyle w:val="VerbatimChar"/>
-              </w:rPr>
-              <w:t xml:space="preserve">entrada_menu.py</w:t>
-            </w:r>
-            <w:r>
-              <w:rPr>
-                <w:rStyle w:val="VerbatimChar"/>
-              </w:rPr>
-              <w:t xml:space="preserve">navegacion.py</w:t>
-            </w:r>
-          </w:p>
-        </w:tc>
-        <w:tc>
-          <w:tcPr/>
-          <w:p>
-            <w:pPr>
-              <w:pStyle w:val="Compact"/>
-            </w:pPr>
-            <w:r>
-              <w:t xml:space="preserve">Teclas (</w:t>
-            </w:r>
-            <w:r>
-              <w:rPr>
-                <w:rStyle w:val="VerbatimChar"/>
-              </w:rPr>
-              <w:t xml:space="preserve">msvcrt</w:t>
-            </w:r>
-            <w:r>
-              <w:t xml:space="preserve"> </w:t>
-            </w:r>
-            <w:r>
-              <w:t xml:space="preserve">en Windows), menús, pausa, ayuda</w:t>
-            </w:r>
-          </w:p>
-        </w:tc>
-      </w:tr>
-      <w:tr>
-        <w:tc>
-          <w:tcPr/>
-          <w:p>
-            <w:pPr>
-              <w:pStyle w:val="Compact"/>
-            </w:pPr>
-            <w:r>
-              <w:t xml:space="preserve">Historia</w:t>
-            </w:r>
-          </w:p>
-        </w:tc>
-        <w:tc>
-          <w:tcPr/>
-          <w:p>
-            <w:pPr>
-              <w:pStyle w:val="Compact"/>
-            </w:pPr>
-            <w:r>
-              <w:rPr>
-                <w:rStyle w:val="VerbatimChar"/>
-              </w:rPr>
-              <w:t xml:space="preserve">generador_examen_historia.py</w:t>
+              <w:t xml:space="preserve">Comun/generador_examen_historia.py</w:t>
             </w:r>
           </w:p>
         </w:tc>
@@ -2781,7 +2784,7 @@
         <w:rPr>
           <w:rStyle w:val="VerbatimChar"/>
         </w:rPr>
-        <w:t xml:space="preserve">motor_partida.py</w:t>
+        <w:t xml:space="preserve">motor_nucleo.py</w:t>
       </w:r>
       <w:r>
         <w:t xml:space="preserve">). Según el preset de reglas:</w:t>
@@ -3158,7 +3161,7 @@
               <w:t xml:space="preserve"> </w:t>
             </w:r>
             <w:r>
-              <w:t xml:space="preserve">(consola;</w:t>
+              <w:t xml:space="preserve">(terminal;</w:t>
             </w:r>
             <w:r>
               <w:t xml:space="preserve"> </w:t>
@@ -3246,13 +3249,13 @@
                 <w:b/>
                 <w:bCs/>
               </w:rPr>
-              <w:t xml:space="preserve">262</w:t>
+              <w:t xml:space="preserve">246</w:t>
             </w:r>
             <w:r>
               <w:t xml:space="preserve"> </w:t>
             </w:r>
             <w:r>
-              <w:t xml:space="preserve">tests: 254 + 8 en</w:t>
+              <w:t xml:space="preserve">tests: 238 + 8 en</w:t>
             </w:r>
             <w:r>
               <w:t xml:space="preserve"> </w:t>
@@ -3321,7 +3324,7 @@
               <w:pStyle w:val="Compact"/>
             </w:pPr>
             <w:r>
-              <w:t xml:space="preserve">Identificación de solapamiento temático y prerrequisitos (véase sección 7)</w:t>
+              <w:t xml:space="preserve">Identificación de solapamiento temático y prerrequisitos (véase §6.2)</w:t>
             </w:r>
           </w:p>
         </w:tc>
@@ -3348,7 +3351,7 @@
               <w:rPr>
                 <w:rStyle w:val="VerbatimChar"/>
               </w:rPr>
-              <w:t xml:space="preserve">simulacion_evaluacion_azar.py</w:t>
+              <w:t xml:space="preserve">Files/simulacion_evaluacion_azar.py</w:t>
             </w:r>
             <w:r>
               <w:t xml:space="preserve"> </w:t>
@@ -3447,7 +3450,16 @@
         </w:numPr>
       </w:pPr>
       <w:r>
-        <w:t xml:space="preserve">Los modos de juego principales eran ejecutables sin errores en el flujo principal (consola y gráfico).</w:t>
+        <w:t xml:space="preserve">Los modos de juego principales eran ejecutables sin errores en el flujo principal (</w:t>
+      </w:r>
+      <w:r>
+        <w:rPr>
+          <w:rStyle w:val="VerbatimChar"/>
+        </w:rPr>
+        <w:t xml:space="preserve">juego_grafico.py</w:t>
+      </w:r>
+      <w:r>
+        <w:t xml:space="preserve">).</w:t>
       </w:r>
     </w:p>
     <w:p>
@@ -3724,23 +3736,23 @@
         <w:t xml:space="preserve"> </w:t>
       </w:r>
       <w:r>
-        <w:t xml:space="preserve">cuestionario en consola y</w:t>
-      </w:r>
-      <w:r>
-        <w:t xml:space="preserve"> </w:t>
-      </w:r>
-      <w:r>
-        <w:rPr>
-          <w:b/>
-          <w:bCs/>
-        </w:rPr>
-        <w:t xml:space="preserve">versión gráfica</w:t>
-      </w:r>
-      <w:r>
-        <w:t xml:space="preserve"> </w:t>
-      </w:r>
-      <w:r>
-        <w:t xml:space="preserve">pygame con cuatro modos operativos (libre, historia, resistencia, feedback), banco de</w:t>
+        <w:t xml:space="preserve">cuestionario en</w:t>
+      </w:r>
+      <w:r>
+        <w:t xml:space="preserve"> </w:t>
+      </w:r>
+      <w:r>
+        <w:rPr>
+          <w:b/>
+          <w:bCs/>
+        </w:rPr>
+        <w:t xml:space="preserve">pygame</w:t>
+      </w:r>
+      <w:r>
+        <w:t xml:space="preserve"> </w:t>
+      </w:r>
+      <w:r>
+        <w:t xml:space="preserve">con cuatro modos operativos (libre, historia, resistencia, feedback), banco de</w:t>
       </w:r>
       <w:r>
         <w:t xml:space="preserve"> </w:t>
@@ -3756,7 +3768,7 @@
         <w:t xml:space="preserve"> </w:t>
       </w:r>
       <w:r>
-        <w:t xml:space="preserve">revisadas manualmente, herramientas de mantenimiento del dataset y empaquetado opcional en ejecutable Windows. La capa narrativa escape room / novela gráfica completa queda como evolución futura.</w:t>
+        <w:t xml:space="preserve">revisadas manualmente y herramientas de mantenimiento del dataset. La capa narrativa escape room / novela gráfica completa queda como evolución futura.</w:t>
       </w:r>
     </w:p>
     <w:p>
@@ -3764,7 +3776,49 @@
         <w:pStyle w:val="BodyText"/>
       </w:pPr>
       <w:r>
-        <w:t xml:space="preserve">Se entregó un cuestionario en consola funcional:</w:t>
+        <w:t xml:space="preserve">El desarrollo siguió un enfoque incremental: un prototipo en terminal validó el motor de evaluación; la interfaz gráfica concentró después toda la experiencia de juego. En junio de 2026 se eliminó la capa de consola y se unificó el código en</w:t>
+      </w:r>
+      <w:r>
+        <w:t xml:space="preserve"> </w:t>
+      </w:r>
+      <w:r>
+        <w:rPr>
+          <w:rStyle w:val="VerbatimChar"/>
+        </w:rPr>
+        <w:t xml:space="preserve">juego_grafico.py</w:t>
+      </w:r>
+      <w:r>
+        <w:t xml:space="preserve"> </w:t>
+      </w:r>
+      <w:r>
+        <w:t xml:space="preserve">con dominio en</w:t>
+      </w:r>
+      <w:r>
+        <w:t xml:space="preserve"> </w:t>
+      </w:r>
+      <w:r>
+        <w:rPr>
+          <w:rStyle w:val="VerbatimChar"/>
+        </w:rPr>
+        <w:t xml:space="preserve">Juego/Comun/</w:t>
+      </w:r>
+      <w:r>
+        <w:t xml:space="preserve"> </w:t>
+      </w:r>
+      <w:r>
+        <w:t xml:space="preserve">e interfaz en</w:t>
+      </w:r>
+      <w:r>
+        <w:t xml:space="preserve"> </w:t>
+      </w:r>
+      <w:r>
+        <w:rPr>
+          <w:rStyle w:val="VerbatimChar"/>
+        </w:rPr>
+        <w:t xml:space="preserve">Juego/Grafico/</w:t>
+      </w:r>
+      <w:r>
+        <w:t xml:space="preserve">.</w:t>
       </w:r>
     </w:p>
     <w:tbl>
@@ -3827,13 +3881,7 @@
               <w:rPr>
                 <w:rStyle w:val="VerbatimChar"/>
               </w:rPr>
-              <w:t xml:space="preserve">Juego/juego_consola.py</w:t>
-            </w:r>
-            <w:r>
-              <w:t xml:space="preserve"> </w:t>
-            </w:r>
-            <w:r>
-              <w:t xml:space="preserve">(tutorial de foco de teclado al inicio)</w:t>
+              <w:t xml:space="preserve">Juego/juego_grafico.py</w:t>
             </w:r>
           </w:p>
         </w:tc>
@@ -3846,7 +3894,7 @@
               <w:pStyle w:val="Compact"/>
             </w:pPr>
             <w:r>
-              <w:t xml:space="preserve">Paquete de lógica</w:t>
+              <w:t xml:space="preserve">Dominio</w:t>
             </w:r>
           </w:p>
         </w:tc>
@@ -3866,22 +3914,40 @@
               <w:t xml:space="preserve"> </w:t>
             </w:r>
             <w:r>
-              <w:t xml:space="preserve">(dominio compartido) +</w:t>
-            </w:r>
-            <w:r>
-              <w:t xml:space="preserve"> </w:t>
-            </w:r>
+              <w:t xml:space="preserve">(motor, reglas, datos, informes, feedback, historia, resistencia)</w:t>
+            </w:r>
+          </w:p>
+        </w:tc>
+      </w:tr>
+      <w:tr>
+        <w:tc>
+          <w:tcPr/>
+          <w:p>
+            <w:pPr>
+              <w:pStyle w:val="Compact"/>
+            </w:pPr>
+            <w:r>
+              <w:t xml:space="preserve">Interfaz</w:t>
+            </w:r>
+          </w:p>
+        </w:tc>
+        <w:tc>
+          <w:tcPr/>
+          <w:p>
+            <w:pPr>
+              <w:pStyle w:val="Compact"/>
+            </w:pPr>
             <w:r>
               <w:rPr>
                 <w:rStyle w:val="VerbatimChar"/>
               </w:rPr>
-              <w:t xml:space="preserve">Juego/Consola/</w:t>
+              <w:t xml:space="preserve">Juego/Grafico/</w:t>
             </w:r>
             <w:r>
               <w:t xml:space="preserve"> </w:t>
             </w:r>
             <w:r>
-              <w:t xml:space="preserve">(UI terminal)</w:t>
+              <w:t xml:space="preserve">(menús, partida, tooltips, barra superior)</w:t>
             </w:r>
           </w:p>
         </w:tc>
@@ -3960,18 +4026,18 @@
               <w:pStyle w:val="Compact"/>
             </w:pPr>
             <w:r>
-              <w:t xml:space="preserve">Modo feedback</w:t>
-            </w:r>
-          </w:p>
-        </w:tc>
-        <w:tc>
-          <w:tcPr/>
-          <w:p>
-            <w:pPr>
-              <w:pStyle w:val="Compact"/>
-            </w:pPr>
-            <w:r>
-              <w:t xml:space="preserve">Guardado local + envío SMTP opcional</w:t>
+              <w:t xml:space="preserve">Modo resistencia</w:t>
+            </w:r>
+          </w:p>
+        </w:tc>
+        <w:tc>
+          <w:tcPr/>
+          <w:p>
+            <w:pPr>
+              <w:pStyle w:val="Compact"/>
+            </w:pPr>
+            <w:r>
+              <w:t xml:space="preserve">Reto del día, apuestas, maldiciones, power-ups</w:t>
             </w:r>
           </w:p>
         </w:tc>
@@ -3984,18 +4050,18 @@
               <w:pStyle w:val="Compact"/>
             </w:pPr>
             <w:r>
-              <w:t xml:space="preserve">Ejecutable</w:t>
-            </w:r>
-          </w:p>
-        </w:tc>
-        <w:tc>
-          <w:tcPr/>
-          <w:p>
-            <w:pPr>
-              <w:pStyle w:val="Compact"/>
-            </w:pPr>
-            <w:r>
-              <w:t xml:space="preserve">Build opcional con PyInstaller</w:t>
+              <w:t xml:space="preserve">Modo feedback</w:t>
+            </w:r>
+          </w:p>
+        </w:tc>
+        <w:tc>
+          <w:tcPr/>
+          <w:p>
+            <w:pPr>
+              <w:pStyle w:val="Compact"/>
+            </w:pPr>
+            <w:r>
+              <w:t xml:space="preserve">Guardado local + envío SMTP opcional</w:t>
             </w:r>
           </w:p>
         </w:tc>
@@ -4883,7 +4949,7 @@
         <w:t xml:space="preserve">mantenimiento.py</w:t>
       </w:r>
       <w:r>
-        <w:t xml:space="preserve">): validación, revisión, pipeline de plantillas, auditorías (salida en consola), deduplicación y estadísticas del histórico de qualificacions. La lógica de claves de contenido y expansión de plantillas se centralizó en</w:t>
+        <w:t xml:space="preserve">): validación, revisión, pipeline de plantillas, auditorías (salida por terminal), deduplicación y estadísticas del histórico de qualificacions. La lógica de claves de contenido y expansión de plantillas se centralizó en</w:t>
       </w:r>
       <w:r>
         <w:t xml:space="preserve"> </w:t>
@@ -4959,7 +5025,7 @@
           <w:b/>
           <w:bCs/>
         </w:rPr>
-        <w:t xml:space="preserve">262</w:t>
+        <w:t xml:space="preserve">246</w:t>
       </w:r>
       <w:r>
         <w:t xml:space="preserve"> </w:t>
@@ -5085,18 +5151,42 @@
               <w:pStyle w:val="Compact"/>
             </w:pPr>
             <w:r>
-              <w:t xml:space="preserve">Módulos Python del juego (Consola)</w:t>
-            </w:r>
-          </w:p>
-        </w:tc>
-        <w:tc>
-          <w:tcPr/>
-          <w:p>
-            <w:pPr>
-              <w:pStyle w:val="Compact"/>
-            </w:pPr>
-            <w:r>
-              <w:t xml:space="preserve">18</w:t>
+              <w:t xml:space="preserve">Módulos Python del juego (</w:t>
+            </w:r>
+            <w:r>
+              <w:rPr>
+                <w:rStyle w:val="VerbatimChar"/>
+              </w:rPr>
+              <w:t xml:space="preserve">Comun/</w:t>
+            </w:r>
+            <w:r>
+              <w:t xml:space="preserve"> </w:t>
+            </w:r>
+            <w:r>
+              <w:t xml:space="preserve">+</w:t>
+            </w:r>
+            <w:r>
+              <w:t xml:space="preserve"> </w:t>
+            </w:r>
+            <w:r>
+              <w:rPr>
+                <w:rStyle w:val="VerbatimChar"/>
+              </w:rPr>
+              <w:t xml:space="preserve">Grafico/</w:t>
+            </w:r>
+            <w:r>
+              <w:t xml:space="preserve">)</w:t>
+            </w:r>
+          </w:p>
+        </w:tc>
+        <w:tc>
+          <w:tcPr/>
+          <w:p>
+            <w:pPr>
+              <w:pStyle w:val="Compact"/>
+            </w:pPr>
+            <w:r>
+              <w:t xml:space="preserve">~35</w:t>
             </w:r>
           </w:p>
         </w:tc>
@@ -5120,7 +5210,7 @@
               <w:pStyle w:val="Compact"/>
             </w:pPr>
             <w:r>
-              <w:t xml:space="preserve">3</w:t>
+              <w:t xml:space="preserve">4</w:t>
             </w:r>
           </w:p>
         </w:tc>
@@ -5133,18 +5223,18 @@
               <w:pStyle w:val="Compact"/>
             </w:pPr>
             <w:r>
-              <w:t xml:space="preserve">Pruebas unitarias</w:t>
-            </w:r>
-          </w:p>
-        </w:tc>
-        <w:tc>
-          <w:tcPr/>
-          <w:p>
-            <w:pPr>
-              <w:pStyle w:val="Compact"/>
-            </w:pPr>
-            <w:r>
-              <w:t xml:space="preserve">4 módulos de test</w:t>
+              <w:t xml:space="preserve">Pruebas automatizadas</w:t>
+            </w:r>
+          </w:p>
+        </w:tc>
+        <w:tc>
+          <w:tcPr/>
+          <w:p>
+            <w:pPr>
+              <w:pStyle w:val="Compact"/>
+            </w:pPr>
+            <w:r>
+              <w:t xml:space="preserve">246</w:t>
             </w:r>
           </w:p>
         </w:tc>
@@ -5836,7 +5926,7 @@
       <w:r>
         <w:drawing>
           <wp:inline>
-            <wp:extent cx="5334000" cy="2122681"/>
+            <wp:extent cx="3810000" cy="2540000"/>
             <wp:effectExtent b="0" l="0" r="0" t="0"/>
             <wp:docPr descr="Distribución simulada de notas y aciertos" title="" id="50" name="Picture"/>
             <a:graphic>
@@ -5857,7 +5947,7 @@
                   <pic:spPr bwMode="auto">
                     <a:xfrm>
                       <a:off x="0" y="0"/>
-                      <a:ext cx="5334000" cy="2122681"/>
+                      <a:ext cx="3810000" cy="2540000"/>
                     </a:xfrm>
                     <a:prstGeom prst="rect">
                       <a:avLst/>
@@ -6623,7 +6713,11 @@
               <w:pStyle w:val="Compact"/>
             </w:pPr>
             <w:r>
-              <w:t xml:space="preserve">Parcial (avanzado)</w:t>
+              <w:rPr>
+                <w:b/>
+                <w:bCs/>
+              </w:rPr>
+              <w:t xml:space="preserve">Cumplido</w:t>
             </w:r>
           </w:p>
         </w:tc>
@@ -6643,7 +6737,7 @@
               <w:t xml:space="preserve"> </w:t>
             </w:r>
             <w:r>
-              <w:t xml:space="preserve">+ libre, historia y resistencia en pygame; tooltips; consola sigue siendo referencia para feedback SMTP</w:t>
+              <w:t xml:space="preserve">con libre, historia, resistencia y feedback; tooltips y barra superior</w:t>
             </w:r>
           </w:p>
         </w:tc>
@@ -6693,7 +6787,7 @@
               <w:pStyle w:val="Compact"/>
             </w:pPr>
             <w:r>
-              <w:t xml:space="preserve">Banco validado, 262 tests + CI; sin estudio con usuarios</w:t>
+              <w:t xml:space="preserve">Banco validado, 246 tests + CI; sin estudio con usuarios</w:t>
             </w:r>
           </w:p>
         </w:tc>
@@ -6720,7 +6814,7 @@
         <w:t xml:space="preserve"> </w:t>
       </w:r>
       <w:r>
-        <w:t xml:space="preserve">OE2, OE3 y OE5 están cubiertos en su versión de consola. OE4 avanza con una interfaz gráfica en pygame (modos libre, historia y resistencia); OE1 (narrativa gráfica completa) queda como trabajo futuro. Esta decisión es defendible: el prototipo valida el núcleo evaluable antes del coste de la capa narrativa visual, en línea con el principio de prototipado incremental en ingeniería del software.</w:t>
+        <w:t xml:space="preserve">OE2, OE3, OE4 y OE5 están cubiertos en la versión pygame. OE1 (narrativa gráfica completa tipo escape room) queda como trabajo futuro. El enfoque incremental —primero validar el núcleo evaluable, después la capa visual— permitió concentrar el esfuerzo en un único lanzador mantenible.</w:t>
       </w:r>
     </w:p>
     <w:bookmarkEnd w:id="57"/>
@@ -7013,7 +7107,32 @@
         <w:pStyle w:val="BodyText"/>
       </w:pPr>
       <w:r>
-        <w:t xml:space="preserve">La interfaz en consola limita la accesibilidad para usuarios no familiarizados con terminal; el tutorial de foco de teclado al inicio mitiga parte de esa barrera, pero una GUI sería deseable para despliegue masivo.</w:t>
+        <w:t xml:space="preserve">La interfaz pygame facilita el despliegue para usuarios no familiarizados con terminal; requiere instalar</w:t>
+      </w:r>
+      <w:r>
+        <w:t xml:space="preserve"> </w:t>
+      </w:r>
+      <w:r>
+        <w:rPr>
+          <w:b/>
+          <w:bCs/>
+        </w:rPr>
+        <w:t xml:space="preserve">pygame-ce</w:t>
+      </w:r>
+      <w:r>
+        <w:t xml:space="preserve"> </w:t>
+      </w:r>
+      <w:r>
+        <w:t xml:space="preserve">(</w:t>
+      </w:r>
+      <w:r>
+        <w:rPr>
+          <w:rStyle w:val="VerbatimChar"/>
+        </w:rPr>
+        <w:t xml:space="preserve">requirements.txt</w:t>
+      </w:r>
+      <w:r>
+        <w:t xml:space="preserve">).</w:t>
       </w:r>
     </w:p>
     <w:bookmarkEnd w:id="59"/>
@@ -7120,13 +7239,13 @@
           <w:b/>
           <w:bCs/>
         </w:rPr>
-        <w:t xml:space="preserve">interfaz en consola</w:t>
-      </w:r>
-      <w:r>
-        <w:t xml:space="preserve"> </w:t>
-      </w:r>
-      <w:r>
-        <w:t xml:space="preserve">reduce el atractivo visual respecto al escape room planteado inicialmente. El</w:t>
+        <w:t xml:space="preserve">interfaz gráfica</w:t>
+      </w:r>
+      <w:r>
+        <w:t xml:space="preserve"> </w:t>
+      </w:r>
+      <w:r>
+        <w:t xml:space="preserve">actual cubre menús y partida, pero aún no implementa la narrativa escape room del documento inicial. El</w:t>
       </w:r>
       <w:r>
         <w:t xml:space="preserve"> </w:t>
@@ -7313,7 +7432,7 @@
         <w:t xml:space="preserve"> </w:t>
       </w:r>
       <w:r>
-        <w:t xml:space="preserve">en consola y gráfico con modos libre, historia, resistencia y feedback que gamifica la autoevaluación;</w:t>
+        <w:t xml:space="preserve">en pygame con modos libre, historia, resistencia y feedback que gamifica la autoevaluación;</w:t>
       </w:r>
     </w:p>
     <w:p>
@@ -7406,7 +7525,7 @@
         <w:pStyle w:val="BodyText"/>
       </w:pPr>
       <w:r>
-        <w:t xml:space="preserve">Las líneas futuras más inmediatas son la validación con usuarios reales (incluida la motivación frente a un listado estático), el enriquecimiento del modelo de datos con multiasignatura y prerrequisitos, y el desarrollo de la interfaz gráfica prevista en el documento de proyecto.</w:t>
+        <w:t xml:space="preserve">Las líneas futuras más inmediatas son la validación con usuarios reales (incluida la motivación frente a un listado estático), el enriquecimiento del modelo de datos con multiasignatura y prerrequisitos, y el desarrollo de la capa narrativa escape room prevista en el documento de proyecto.</w:t>
       </w:r>
     </w:p>
     <w:p>
@@ -7778,7 +7897,7 @@
       </w:r>
     </w:p>
     <w:bookmarkEnd w:id="65"/>
-    <w:bookmarkStart w:id="73" w:name="Xa64dd2c24157f2ab9510a3ab51cede95ea9eec8"/>
+    <w:bookmarkStart w:id="74" w:name="Xa64dd2c24157f2ab9510a3ab51cede95ea9eec8"/>
     <w:p>
       <w:pPr>
         <w:pStyle w:val="Heading2"/>
@@ -7979,7 +8098,7 @@
                 <w:rPr>
                   <w:rStyle w:val="VerbatimChar"/>
                 </w:rPr>
-                <w:t xml:space="preserve">Juego/Comun/README.md</w:t>
+                <w:t xml:space="preserve">Juego/README.md</w:t>
               </w:r>
             </w:hyperlink>
             <w:r>
@@ -7996,7 +8115,24 @@
                 <w:rPr>
                   <w:rStyle w:val="VerbatimChar"/>
                 </w:rPr>
-                <w:t xml:space="preserve">Juego/Consola/README.md</w:t>
+                <w:t xml:space="preserve">Juego/Comun/README.md</w:t>
+              </w:r>
+            </w:hyperlink>
+            <w:r>
+              <w:t xml:space="preserve"> </w:t>
+            </w:r>
+            <w:r>
+              <w:t xml:space="preserve">·</w:t>
+            </w:r>
+            <w:r>
+              <w:t xml:space="preserve"> </w:t>
+            </w:r>
+            <w:hyperlink r:id="rId71">
+              <w:r>
+                <w:rPr>
+                  <w:rStyle w:val="VerbatimChar"/>
+                </w:rPr>
+                <w:t xml:space="preserve">Juego/Grafico/README.md</w:t>
               </w:r>
             </w:hyperlink>
           </w:p>
@@ -8071,7 +8207,7 @@
             <w:pPr>
               <w:pStyle w:val="Compact"/>
             </w:pPr>
-            <w:hyperlink r:id="rId71">
+            <w:hyperlink r:id="rId72">
               <w:r>
                 <w:rPr>
                   <w:rStyle w:val="VerbatimChar"/>
@@ -8151,7 +8287,7 @@
             <w:pPr>
               <w:pStyle w:val="Compact"/>
             </w:pPr>
-            <w:hyperlink r:id="rId72">
+            <w:hyperlink r:id="rId73">
               <w:r>
                 <w:rPr>
                   <w:rStyle w:val="VerbatimChar"/>
@@ -8181,8 +8317,8 @@
         <w:t xml:space="preserve">https://github.com/Dafafi63f/Escape-Room.git</w:t>
       </w:r>
     </w:p>
-    <w:bookmarkEnd w:id="73"/>
     <w:bookmarkEnd w:id="74"/>
+    <w:bookmarkEnd w:id="75"/>
     <w:sectPr>
       <w:footnotePr>
         <w:numRestart w:val="eachSect"/>

</xml_diff>